<commit_message>
Fix run-together book details in three pieces
The <details> tag content for Robin Robertson, John Wilkinson, and
Taylor Swift used Enter (separate paragraphs) instead of Shift+Enter
between lines, so the converter concatenated them with no separator
once details started being displayed on the site. Patched the line
breaks to soft breaks directly in each .docx and re-ran the
converter; article bodies are unchanged.

Co-Authored-By: Claude Sonnet 5 <noreply@anthropic.com>
Claude-Session: https://claude.ai/code/session_01NEiSPdGPQ5yu3jyGEnLrsy
</commit_message>
<xml_diff>
--- a/content-src/docx/R G 2002 03 16 Robin Robertson.docx
+++ b/content-src/docx/R G 2002 03 16 Robin Robertson.docx
@@ -40,13 +40,15 @@
       <w:r>
         <w:t>Slow Air</w:t>
       </w:r>
-    </w:p>
-    <w:p>
+      <w:r>
+        <w:br/>
+      </w:r>
       <w:r>
         <w:t>Robin Robertson</w:t>
       </w:r>
-    </w:p>
-    <w:p>
+      <w:r>
+        <w:br/>
+      </w:r>
       <w:r>
         <w:t>66pp, Picador, £7.99.</w:t>
       </w:r>

</xml_diff>